<commit_message>
Highlight deferred items in red in committee summary
Mark all "預かり案件" (items held by the secretariat for Reiwa 8 continued
review) in red bold so they stand out in the document.

https://claude.ai/code/session_01VrZKKeVwMqjptc4NYchnsZ
</commit_message>
<xml_diff>
--- a/練馬区学校事故詳細調査委員会_委員意見まとめ.docx
+++ b/練馬区学校事故詳細調査委員会_委員意見まとめ.docx
@@ -144,7 +144,11 @@
         <w:pStyle w:val="ListBullet"/>
       </w:pPr>
       <w:r>
-        <w:t>公表については保護者意向と区の方針の整合を踏まえ再検討する。</w:t>
+        <w:rPr>
+          <w:b/>
+          <w:color w:val="C00000"/>
+        </w:rPr>
+        <w:t>【預かり案件】公表については保護者意向と区の方針の整合を踏まえ再検討する。</w:t>
       </w:r>
     </w:p>
     <w:p>
@@ -464,7 +468,11 @@
         <w:pStyle w:val="ListBullet"/>
       </w:pPr>
       <w:r>
-        <w:t>要綱第3条の見直しは事務局で前向きに検討する。</w:t>
+        <w:rPr>
+          <w:b/>
+          <w:color w:val="C00000"/>
+        </w:rPr>
+        <w:t>【預かり案件】要綱第3条の見直しは事務局で前向きに検討する。</w:t>
       </w:r>
     </w:p>
     <w:p>
@@ -608,7 +616,11 @@
         <w:pStyle w:val="ListBullet"/>
       </w:pPr>
       <w:r>
-        <w:t>報告書フォーマット作成について事務局で預かる（検討課題とする）。</w:t>
+        <w:rPr>
+          <w:b/>
+          <w:color w:val="C00000"/>
+        </w:rPr>
+        <w:t>【預かり案件】報告書フォーマット作成について事務局で預かる（検討課題とする）。</w:t>
       </w:r>
     </w:p>
     <w:p>
@@ -616,7 +628,11 @@
         <w:pStyle w:val="ListBullet"/>
       </w:pPr>
       <w:r>
-        <w:t>第2条(1)（自殺・自殺疑い）対応のフロー化・マニュアル化も事務局で預かる。</w:t>
+        <w:rPr>
+          <w:b/>
+          <w:color w:val="C00000"/>
+        </w:rPr>
+        <w:t>【預かり案件】第2条(1)（自殺・自殺疑い）対応のフロー化・マニュアル化も事務局で預かる。</w:t>
       </w:r>
     </w:p>
     <w:p>
@@ -637,11 +653,18 @@
         <w:pStyle w:val="Heading1"/>
       </w:pPr>
       <w:r>
-        <w:t>■ 令和8年度に持ち越されている事案</w:t>
+        <w:rPr>
+          <w:color w:val="C00000"/>
+        </w:rPr>
+        <w:t>■ 令和8年度に持ち越されている事案（預かり案件）</w:t>
       </w:r>
     </w:p>
     <w:p>
       <w:r>
+        <w:rPr>
+          <w:b/>
+          <w:color w:val="C00000"/>
+        </w:rPr>
         <w:t>各委員会で「事務局で検討する」「事務局で預かる」等の整理となり、令和8年度以降に継続検討すべき事項を抽出した。</w:t>
       </w:r>
     </w:p>
@@ -677,7 +700,11 @@
         <w:pStyle w:val="ListBullet"/>
       </w:pPr>
       <w:r>
-        <w:t>事務局回答：「事務局で前向きに検討する」 → 令和8年度継続検討。</w:t>
+        <w:rPr>
+          <w:b/>
+          <w:color w:val="C00000"/>
+        </w:rPr>
+        <w:t>【預かり案件】事務局回答：「事務局で前向きに検討する」 → 令和8年度継続検討。</w:t>
       </w:r>
     </w:p>
     <w:p>
@@ -712,7 +739,11 @@
         <w:pStyle w:val="ListBullet"/>
       </w:pPr>
       <w:r>
-        <w:t>事務局回答：「事務局で一旦預かる」 → 令和8年度継続検討。</w:t>
+        <w:rPr>
+          <w:b/>
+          <w:color w:val="C00000"/>
+        </w:rPr>
+        <w:t>【預かり案件】事務局回答：「事務局で一旦預かる」 → 令和8年度継続検討。</w:t>
       </w:r>
     </w:p>
     <w:p>
@@ -747,7 +778,11 @@
         <w:pStyle w:val="ListBullet"/>
       </w:pPr>
       <w:r>
-        <w:t>事務局回答：「事務局で預かる」 → 令和8年度継続検討。</w:t>
+        <w:rPr>
+          <w:b/>
+          <w:color w:val="C00000"/>
+        </w:rPr>
+        <w:t>【預かり案件】事務局回答：「事務局で預かる」 → 令和8年度継続検討。</w:t>
       </w:r>
     </w:p>
     <w:p>
@@ -782,7 +817,11 @@
         <w:pStyle w:val="ListBullet"/>
       </w:pPr>
       <w:r>
-        <w:t>扱い：事務局では事故報告書をもって対応終了としているが、委員提言を踏まえた整理は令和8年度に継続検討すべき事項と整理。</w:t>
+        <w:rPr>
+          <w:b/>
+          <w:color w:val="C00000"/>
+        </w:rPr>
+        <w:t>【預かり案件】扱い：事務局では事故報告書をもって対応終了としているが、委員提言を踏まえた整理は令和8年度に継続検討すべき事項と整理。</w:t>
       </w:r>
     </w:p>
     <w:p>
@@ -817,7 +856,11 @@
         <w:pStyle w:val="ListBullet"/>
       </w:pPr>
       <w:r>
-        <w:t>事務局回答：「事務局で検討していく」 → 令和8年度継続検討。</w:t>
+        <w:rPr>
+          <w:b/>
+          <w:color w:val="C00000"/>
+        </w:rPr>
+        <w:t>【預かり案件】事務局回答：「事務局で検討していく」 → 令和8年度継続検討。</w:t>
       </w:r>
     </w:p>
     <w:p>
@@ -887,7 +930,11 @@
         <w:pStyle w:val="ListBullet"/>
       </w:pPr>
       <w:r>
-        <w:t>扱い：今後の課題として小林委員が問題提起。令和8年度に継続検討すべき事項。</w:t>
+        <w:rPr>
+          <w:b/>
+          <w:color w:val="C00000"/>
+        </w:rPr>
+        <w:t>【預かり案件】扱い：今後の課題として小林委員が問題提起。令和8年度に継続検討すべき事項。</w:t>
       </w:r>
     </w:p>
     <w:p>
@@ -922,7 +969,11 @@
         <w:pStyle w:val="ListBullet"/>
       </w:pPr>
       <w:r>
-        <w:t>扱い：学校現場での具体的施策の検討は令和8年度以降に継続。</w:t>
+        <w:rPr>
+          <w:b/>
+          <w:color w:val="C00000"/>
+        </w:rPr>
+        <w:t>【預かり案件】扱い：学校現場での具体的施策の検討は令和8年度以降に継続。</w:t>
       </w:r>
     </w:p>
     <w:sectPr>

</xml_diff>